<commit_message>
docs(architecture): align storage and booking boundaries
</commit_message>
<xml_diff>
--- a/docs/MeetBroker-Technical-Overview.docx
+++ b/docs/MeetBroker-Technical-Overview.docx
@@ -128,7 +128,7 @@
               <a:graphicData uri="http://schemas.openxmlformats.org/drawingml/2006/picture">
                 <pic:pic>
                   <pic:nvPicPr>
-                    <pic:cNvPr id="0" name="tmpqkbaektw.png"/>
+                    <pic:cNvPr id="0" name="tmpw5xoht74.png"/>
                     <pic:cNvPicPr/>
                   </pic:nvPicPr>
                   <pic:blipFill>
@@ -2199,7 +2199,7 @@
               <a:graphicData uri="http://schemas.openxmlformats.org/drawingml/2006/picture">
                 <pic:pic>
                   <pic:nvPicPr>
-                    <pic:cNvPr id="0" name="tmpuvk9jawj.png"/>
+                    <pic:cNvPr id="0" name="tmpc2rcepkz.png"/>
                     <pic:cNvPicPr/>
                   </pic:nvPicPr>
                   <pic:blipFill>
@@ -2536,7 +2536,15 @@
               <w:rPr>
                 <w:sz w:val="17"/>
               </w:rPr>
-              <w:t>Розклад, кімнатні/онлайн зустрічі, recurrence, учасники</w:t>
+              <w:t xml:space="preserve">Розклад, кімнатні/онлайн зустрічі, recurrence; блокування й конфлікти учасників ізольовані в </w:t>
+            </w:r>
+            <w:r>
+              <w:rPr>
+                <w:rFonts w:ascii="Courier New" w:hAnsi="Courier New"/>
+                <w:color w:val="1488FF"/>
+                <w:sz w:val="17"/>
+              </w:rPr>
+              <w:t>BookingAttendeesService</w:t>
             </w:r>
           </w:p>
         </w:tc>
@@ -4911,7 +4919,7 @@
               <a:graphicData uri="http://schemas.openxmlformats.org/drawingml/2006/picture">
                 <pic:pic>
                   <pic:nvPicPr>
-                    <pic:cNvPr id="0" name="tmpedwuz182.png"/>
+                    <pic:cNvPr id="0" name="tmpans11woj.png"/>
                     <pic:cNvPicPr/>
                   </pic:nvPicPr>
                   <pic:blipFill>
@@ -5061,7 +5069,7 @@
               <a:graphicData uri="http://schemas.openxmlformats.org/drawingml/2006/picture">
                 <pic:pic>
                   <pic:nvPicPr>
-                    <pic:cNvPr id="0" name="tmp689rgmyj.png"/>
+                    <pic:cNvPr id="0" name="tmp8cc9k10e.png"/>
                     <pic:cNvPicPr/>
                   </pic:nvPicPr>
                   <pic:blipFill>

</xml_diff>

<commit_message>
docs(release): prepare v0.2.0 publication
</commit_message>
<xml_diff>
--- a/docs/MeetBroker-Technical-Overview.docx
+++ b/docs/MeetBroker-Technical-Overview.docx
@@ -128,7 +128,7 @@
               <a:graphicData uri="http://schemas.openxmlformats.org/drawingml/2006/picture">
                 <pic:pic>
                   <pic:nvPicPr>
-                    <pic:cNvPr id="0" name="tmpw5xoht74.png"/>
+                    <pic:cNvPr id="0" name="tmpj7mxdrkh.png"/>
                     <pic:cNvPicPr/>
                   </pic:nvPicPr>
                   <pic:blipFill>
@@ -1368,7 +1368,7 @@
         <w:br/>
         <w:t>Nginx :8080</w:t>
         <w:br/>
-        <w:t xml:space="preserve">  |-- /             -&gt; React web :4173</w:t>
+        <w:t xml:space="preserve">  |-- /             -&gt; compiled React SPA</w:t>
         <w:br/>
         <w:t xml:space="preserve">  |-- /api/*        -&gt; NestJS API :3000</w:t>
         <w:br/>
@@ -1532,7 +1532,7 @@
               <w:rPr>
                 <w:sz w:val="17"/>
               </w:rPr>
-              <w:t>Nginx 1.27 Alpine</w:t>
+              <w:t>Nginx 1.27 Alpine + compiled React 19/Vite SPA</w:t>
             </w:r>
           </w:p>
         </w:tc>
@@ -1556,7 +1556,7 @@
               <w:rPr>
                 <w:sz w:val="17"/>
               </w:rPr>
-              <w:t>Єдина зовнішня точка, reverse proxy, базові security headers</w:t>
+              <w:t>Єдина зовнішня точка, статичний frontend, reverse proxy, базові security headers</w:t>
             </w:r>
           </w:p>
         </w:tc>
@@ -1584,7 +1584,7 @@
                 <w:color w:val="1488FF"/>
                 <w:sz w:val="17"/>
               </w:rPr>
-              <w:t>web</w:t>
+              <w:t>api</w:t>
             </w:r>
           </w:p>
         </w:tc>
@@ -1608,7 +1608,7 @@
               <w:rPr>
                 <w:sz w:val="17"/>
               </w:rPr>
-              <w:t>React 19, TypeScript, Vite</w:t>
+              <w:t>NestJS 11, Node.js 24</w:t>
             </w:r>
           </w:p>
         </w:tc>
@@ -1632,7 +1632,7 @@
               <w:rPr>
                 <w:sz w:val="17"/>
               </w:rPr>
-              <w:t>SPA, календар, форми, адміністративний UI</w:t>
+              <w:t>HTTP API, правила предметної області, транзакції</w:t>
             </w:r>
           </w:p>
         </w:tc>
@@ -1660,7 +1660,7 @@
                 <w:color w:val="1488FF"/>
                 <w:sz w:val="17"/>
               </w:rPr>
-              <w:t>api</w:t>
+              <w:t>worker</w:t>
             </w:r>
           </w:p>
         </w:tc>
@@ -1684,7 +1684,7 @@
               <w:rPr>
                 <w:sz w:val="17"/>
               </w:rPr>
-              <w:t>NestJS 11, Node.js 24</w:t>
+              <w:t>Той самий API image</w:t>
             </w:r>
           </w:p>
         </w:tc>
@@ -1708,7 +1708,7 @@
               <w:rPr>
                 <w:sz w:val="17"/>
               </w:rPr>
-              <w:t>HTTP API, правила предметної області, транзакції</w:t>
+              <w:t>Outbox, повторні спроби, email і Telegram</w:t>
             </w:r>
           </w:p>
         </w:tc>
@@ -1736,7 +1736,7 @@
                 <w:color w:val="1488FF"/>
                 <w:sz w:val="17"/>
               </w:rPr>
-              <w:t>worker</w:t>
+              <w:t>postgres</w:t>
             </w:r>
           </w:p>
         </w:tc>
@@ -1760,7 +1760,7 @@
               <w:rPr>
                 <w:sz w:val="17"/>
               </w:rPr>
-              <w:t>Той самий API image</w:t>
+              <w:t>PostgreSQL 17</w:t>
             </w:r>
           </w:p>
         </w:tc>
@@ -1784,82 +1784,6 @@
               <w:rPr>
                 <w:sz w:val="17"/>
               </w:rPr>
-              <w:t>Outbox, повторні спроби, email і Telegram</w:t>
-            </w:r>
-          </w:p>
-        </w:tc>
-      </w:tr>
-      <w:tr>
-        <w:tc>
-          <w:tcPr>
-            <w:tcW w:type="dxa" w:w="3289"/>
-            <w:shd w:fill="EAF4FF"/>
-            <w:tcMar>
-              <w:top w:w="100" w:type="dxa"/>
-              <w:start w:w="130" w:type="dxa"/>
-              <w:bottom w:w="100" w:type="dxa"/>
-              <w:end w:w="130" w:type="dxa"/>
-            </w:tcMar>
-            <w:vAlign w:val="center"/>
-          </w:tcPr>
-          <w:p>
-            <w:pPr>
-              <w:spacing w:after="0"/>
-            </w:pPr>
-            <w:r>
-              <w:rPr>
-                <w:rFonts w:ascii="Courier New" w:hAnsi="Courier New"/>
-                <w:color w:val="1488FF"/>
-                <w:sz w:val="17"/>
-              </w:rPr>
-              <w:t>postgres</w:t>
-            </w:r>
-          </w:p>
-        </w:tc>
-        <w:tc>
-          <w:tcPr>
-            <w:tcW w:type="dxa" w:w="3289"/>
-            <w:shd w:fill="EAF4FF"/>
-            <w:tcMar>
-              <w:top w:w="100" w:type="dxa"/>
-              <w:start w:w="130" w:type="dxa"/>
-              <w:bottom w:w="100" w:type="dxa"/>
-              <w:end w:w="130" w:type="dxa"/>
-            </w:tcMar>
-            <w:vAlign w:val="center"/>
-          </w:tcPr>
-          <w:p>
-            <w:pPr>
-              <w:spacing w:after="0"/>
-            </w:pPr>
-            <w:r>
-              <w:rPr>
-                <w:sz w:val="17"/>
-              </w:rPr>
-              <w:t>PostgreSQL 17</w:t>
-            </w:r>
-          </w:p>
-        </w:tc>
-        <w:tc>
-          <w:tcPr>
-            <w:tcW w:type="dxa" w:w="3289"/>
-            <w:shd w:fill="EAF4FF"/>
-            <w:tcMar>
-              <w:top w:w="100" w:type="dxa"/>
-              <w:start w:w="130" w:type="dxa"/>
-              <w:bottom w:w="100" w:type="dxa"/>
-              <w:end w:w="130" w:type="dxa"/>
-            </w:tcMar>
-            <w:vAlign w:val="center"/>
-          </w:tcPr>
-          <w:p>
-            <w:pPr>
-              <w:spacing w:after="0"/>
-            </w:pPr>
-            <w:r>
-              <w:rPr>
-                <w:sz w:val="17"/>
-              </w:rPr>
               <w:t>Дані, інваріанти, аудит, черга outbox</w:t>
             </w:r>
           </w:p>
@@ -1873,7 +1797,7 @@
     </w:p>
     <w:p>
       <w:r>
-        <w:t>API та worker не збирають два різні application images. Вони запускають різні entry points одного образу. У single-instance Compose API застосовує міграції та опційний demo seed до старту NestJS; worker очікує його health check. У multi-replica production міграції мають бути окремим deployment job на тому самому image.</w:t>
+        <w:t>API та worker не збирають два різні application images. Вони запускають різні entry points одного образу. У single-instance Compose API застосовує міграції та опційний demo seed до старту NestJS; worker очікує його health check. У multi-replica production міграції мають бути окремим deployment job на тому самому image. Frontend також не потребує окремого runtime: multi-stage Nginx image збирає Vite SPA й копіює лише готову статику.</w:t>
       </w:r>
     </w:p>
     <w:p>
@@ -1980,7 +1904,12 @@
         <w:ind w:left="369" w:hanging="142"/>
       </w:pPr>
       <w:r>
-        <w:t>модульні CSS-файли, semantic tokens і спільні UI-компоненти.</w:t>
+        <w:t>модульні CSS-файли (tokens, app shell, controls, schedule, overlays,</w:t>
+      </w:r>
+    </w:p>
+    <w:p>
+      <w:r>
+        <w:t>administration surfaces), semantic tokens і спільні UI-компоненти.</w:t>
       </w:r>
     </w:p>
     <w:p>
@@ -2199,7 +2128,7 @@
               <a:graphicData uri="http://schemas.openxmlformats.org/drawingml/2006/picture">
                 <pic:pic>
                   <pic:nvPicPr>
-                    <pic:cNvPr id="0" name="tmpc2rcepkz.png"/>
+                    <pic:cNvPr id="0" name="tmp87o05i6k.png"/>
                     <pic:cNvPicPr/>
                   </pic:nvPicPr>
                   <pic:blipFill>
@@ -2536,15 +2465,7 @@
               <w:rPr>
                 <w:sz w:val="17"/>
               </w:rPr>
-              <w:t xml:space="preserve">Розклад, кімнатні/онлайн зустрічі, recurrence; блокування й конфлікти учасників ізольовані в </w:t>
-            </w:r>
-            <w:r>
-              <w:rPr>
-                <w:rFonts w:ascii="Courier New" w:hAnsi="Courier New"/>
-                <w:color w:val="1488FF"/>
-                <w:sz w:val="17"/>
-              </w:rPr>
-              <w:t>BookingAttendeesService</w:t>
+              <w:t>Розклад, кімнатні/онлайн зустрічі й recurrence; query, create, update, RSVP, cancellation, attendee, media та open-event boundaries ізольовані</w:t>
             </w:r>
           </w:p>
         </w:tc>
@@ -3155,6 +3076,99 @@
       </w:r>
     </w:p>
     <w:p>
+      <w:r>
+        <w:t xml:space="preserve">Пошукові запити використовують параметризований </w:t>
+      </w:r>
+      <w:r>
+        <w:rPr>
+          <w:rFonts w:ascii="Courier New" w:hAnsi="Courier New"/>
+          <w:color w:val="1488FF"/>
+          <w:sz w:val="18"/>
+        </w:rPr>
+        <w:t>ILIKE</w:t>
+      </w:r>
+      <w:r>
+        <w:t xml:space="preserve"> із буквальним екрануванням </w:t>
+      </w:r>
+      <w:r>
+        <w:rPr>
+          <w:rFonts w:ascii="Courier New" w:hAnsi="Courier New"/>
+          <w:color w:val="1488FF"/>
+          <w:sz w:val="18"/>
+        </w:rPr>
+        <w:t>%</w:t>
+      </w:r>
+      <w:r>
+        <w:t xml:space="preserve">, </w:t>
+      </w:r>
+      <w:r>
+        <w:rPr>
+          <w:rFonts w:ascii="Courier New" w:hAnsi="Courier New"/>
+          <w:color w:val="1488FF"/>
+          <w:sz w:val="18"/>
+        </w:rPr>
+        <w:t>_</w:t>
+      </w:r>
+      <w:r>
+        <w:t xml:space="preserve"> і </w:t>
+      </w:r>
+      <w:r>
+        <w:rPr>
+          <w:rFonts w:ascii="Courier New" w:hAnsi="Courier New"/>
+          <w:color w:val="1488FF"/>
+          <w:sz w:val="18"/>
+        </w:rPr>
+        <w:t>\</w:t>
+      </w:r>
+      <w:r>
+        <w:t xml:space="preserve">. Міграція </w:t>
+      </w:r>
+      <w:r>
+        <w:rPr>
+          <w:rFonts w:ascii="Courier New" w:hAnsi="Courier New"/>
+          <w:color w:val="1488FF"/>
+          <w:sz w:val="18"/>
+        </w:rPr>
+        <w:t>015</w:t>
+      </w:r>
+      <w:r>
+        <w:t xml:space="preserve"> додає </w:t>
+      </w:r>
+      <w:r>
+        <w:rPr>
+          <w:rFonts w:ascii="Courier New" w:hAnsi="Courier New"/>
+          <w:color w:val="1488FF"/>
+          <w:sz w:val="18"/>
+        </w:rPr>
+        <w:t>pg_trgm</w:t>
+      </w:r>
+      <w:r>
+        <w:t xml:space="preserve"> GIN-індекси для назв, email і кімнат, а також частковий індекс майбутніх відкритих подій та складені індекси attendee/outbox-проєкцій. План відкритих подій підтверджено </w:t>
+      </w:r>
+      <w:r>
+        <w:rPr>
+          <w:rFonts w:ascii="Courier New" w:hAnsi="Courier New"/>
+          <w:color w:val="1488FF"/>
+          <w:sz w:val="18"/>
+        </w:rPr>
+        <w:t>Index Only Scan</w:t>
+      </w:r>
+      <w:r>
+        <w:t xml:space="preserve">, а title search — </w:t>
+      </w:r>
+      <w:r>
+        <w:rPr>
+          <w:rFonts w:ascii="Courier New" w:hAnsi="Courier New"/>
+          <w:color w:val="1488FF"/>
+          <w:sz w:val="18"/>
+        </w:rPr>
+        <w:t>Bitmap Index Scan</w:t>
+      </w:r>
+      <w:r>
+        <w:t>.</w:t>
+      </w:r>
+    </w:p>
+    <w:p>
       <w:pPr>
         <w:pStyle w:val="Heading1"/>
         <w:spacing w:before="320"/>
@@ -3647,7 +3661,29 @@
     </w:p>
     <w:p>
       <w:r>
-        <w:t>Outbox має унікальний event key, статуси, retry metadata та атомарне claiming. Повторний цикл worker не створює дублікати. Збій SMTP або Telegram не відкочує бронювання.</w:t>
+        <w:t xml:space="preserve">Outbox має унікальний event key, статуси, retry metadata та атомарне claiming. Повторний цикл worker не створює дублікати. Збій SMTP або Telegram не відкочує бронювання. Окремий </w:t>
+      </w:r>
+      <w:r>
+        <w:rPr>
+          <w:rFonts w:ascii="Courier New" w:hAnsi="Courier New"/>
+          <w:color w:val="1488FF"/>
+          <w:sz w:val="18"/>
+        </w:rPr>
+        <w:t>updated_at</w:t>
+      </w:r>
+      <w:r>
+        <w:t xml:space="preserve"> дозволяє worker повернути в чергу job, що завис у </w:t>
+      </w:r>
+      <w:r>
+        <w:rPr>
+          <w:rFonts w:ascii="Courier New" w:hAnsi="Courier New"/>
+          <w:color w:val="1488FF"/>
+          <w:sz w:val="18"/>
+        </w:rPr>
+        <w:t>PROCESSING</w:t>
+      </w:r>
+      <w:r>
+        <w:t xml:space="preserve"> після аварії. Адміністратор бачить пагінований стан доставки, retry budget і помилку та може контрольовано повторити лише невдалу доставку; ця дія фіксується в audit log.</w:t>
       </w:r>
     </w:p>
     <w:p>
@@ -3830,6 +3866,21 @@
       </w:r>
       <w:r>
         <w:t xml:space="preserve"> для інсталяцій без Telegram.</w:t>
+      </w:r>
+    </w:p>
+    <w:p>
+      <w:pPr>
+        <w:pStyle w:val="ListBullet"/>
+        <w:spacing w:after="60"/>
+        <w:ind w:left="369" w:hanging="142"/>
+      </w:pPr>
+      <w:r>
+        <w:t>локалізований HTML renderer із семантичними емодзі за типом події,</w:t>
+      </w:r>
+    </w:p>
+    <w:p>
+      <w:r>
+        <w:t>брендованою ієрархією та екрануванням користувацького тексту.</w:t>
       </w:r>
     </w:p>
     <w:p>
@@ -4919,7 +4970,7 @@
               <a:graphicData uri="http://schemas.openxmlformats.org/drawingml/2006/picture">
                 <pic:pic>
                   <pic:nvPicPr>
-                    <pic:cNvPr id="0" name="tmpans11woj.png"/>
+                    <pic:cNvPr id="0" name="tmp6t6t2os1.png"/>
                     <pic:cNvPicPr/>
                   </pic:nvPicPr>
                   <pic:blipFill>
@@ -5049,7 +5100,138 @@
     </w:p>
     <w:p>
       <w:r>
+        <w:t xml:space="preserve">Read projections адміністративних списків формує </w:t>
+      </w:r>
+      <w:r>
+        <w:rPr>
+          <w:rFonts w:ascii="Courier New" w:hAnsi="Courier New"/>
+          <w:color w:val="1488FF"/>
+          <w:sz w:val="18"/>
+        </w:rPr>
+        <w:t>AdminQueriesService</w:t>
+      </w:r>
+      <w:r>
+        <w:t xml:space="preserve">. Команди доступу та кімнат лишаються в компактному </w:t>
+      </w:r>
+      <w:r>
+        <w:rPr>
+          <w:rFonts w:ascii="Courier New" w:hAnsi="Courier New"/>
+          <w:color w:val="1488FF"/>
+          <w:sz w:val="18"/>
+        </w:rPr>
+        <w:t>AdminService</w:t>
+      </w:r>
+      <w:r>
+        <w:t xml:space="preserve">, тоді як графіки/недоступність і media lifecycle ізольовані у </w:t>
+      </w:r>
+      <w:r>
+        <w:rPr>
+          <w:rFonts w:ascii="Courier New" w:hAnsi="Courier New"/>
+          <w:color w:val="1488FF"/>
+          <w:sz w:val="18"/>
+        </w:rPr>
+        <w:t>RoomAvailabilityService</w:t>
+      </w:r>
+      <w:r>
+        <w:t xml:space="preserve"> та </w:t>
+      </w:r>
+      <w:r>
+        <w:rPr>
+          <w:rFonts w:ascii="Courier New" w:hAnsi="Courier New"/>
+          <w:color w:val="1488FF"/>
+          <w:sz w:val="18"/>
+        </w:rPr>
+        <w:t>RoomMediaService</w:t>
+      </w:r>
+      <w:r>
+        <w:t>.</w:t>
+      </w:r>
+    </w:p>
+    <w:p>
+      <w:r>
         <w:t>Користувацьке сповіщення окремо повідомляє, якщо зустріч змінив або скасував адміністратор.</w:t>
+      </w:r>
+    </w:p>
+    <w:p>
+      <w:r>
+        <w:t xml:space="preserve">Відкриті події мають окремий </w:t>
+      </w:r>
+      <w:r>
+        <w:rPr>
+          <w:rFonts w:ascii="Courier New" w:hAnsi="Courier New"/>
+          <w:color w:val="1488FF"/>
+          <w:sz w:val="18"/>
+        </w:rPr>
+        <w:t>OpenEventsService</w:t>
+      </w:r>
+      <w:r>
+        <w:t xml:space="preserve">, серверний пошук за назвою, кімнатою або організатором і сторінкову видачу по 12 карток. Read-side бронювань ізольовано у </w:t>
+      </w:r>
+      <w:r>
+        <w:rPr>
+          <w:rFonts w:ascii="Courier New" w:hAnsi="Courier New"/>
+          <w:color w:val="1488FF"/>
+          <w:sz w:val="18"/>
+        </w:rPr>
+        <w:t>BookingQueriesService</w:t>
+      </w:r>
+      <w:r>
+        <w:t xml:space="preserve">: він формує розклад кімнати, сторінки власної історії та персональний календар. Команди розподілено між </w:t>
+      </w:r>
+      <w:r>
+        <w:rPr>
+          <w:rFonts w:ascii="Courier New" w:hAnsi="Courier New"/>
+          <w:color w:val="1488FF"/>
+          <w:sz w:val="18"/>
+        </w:rPr>
+        <w:t>BookingCreationService</w:t>
+      </w:r>
+      <w:r>
+        <w:t xml:space="preserve">, </w:t>
+      </w:r>
+      <w:r>
+        <w:rPr>
+          <w:rFonts w:ascii="Courier New" w:hAnsi="Courier New"/>
+          <w:color w:val="1488FF"/>
+          <w:sz w:val="18"/>
+        </w:rPr>
+        <w:t>BookingUpdatesService</w:t>
+      </w:r>
+      <w:r>
+        <w:t xml:space="preserve">, </w:t>
+      </w:r>
+      <w:r>
+        <w:rPr>
+          <w:rFonts w:ascii="Courier New" w:hAnsi="Courier New"/>
+          <w:color w:val="1488FF"/>
+          <w:sz w:val="18"/>
+        </w:rPr>
+        <w:t>BookingInvitationsService</w:t>
+      </w:r>
+      <w:r>
+        <w:t xml:space="preserve"> і </w:t>
+      </w:r>
+      <w:r>
+        <w:rPr>
+          <w:rFonts w:ascii="Courier New" w:hAnsi="Courier New"/>
+          <w:color w:val="1488FF"/>
+          <w:sz w:val="18"/>
+        </w:rPr>
+        <w:t>BookingCancellationsService</w:t>
+      </w:r>
+      <w:r>
+        <w:t xml:space="preserve">; учасники, обкладинки та відкриті події також мають окремі boundaries. Колишній 1642-рядковий </w:t>
+      </w:r>
+      <w:r>
+        <w:rPr>
+          <w:rFonts w:ascii="Courier New" w:hAnsi="Courier New"/>
+          <w:color w:val="1488FF"/>
+          <w:sz w:val="18"/>
+        </w:rPr>
+        <w:t>BookingsService</w:t>
+      </w:r>
+      <w:r>
+        <w:t xml:space="preserve"> видалено, а HTTP-контракти не змінилися.</w:t>
       </w:r>
     </w:p>
     <w:p>
@@ -5069,7 +5251,7 @@
               <a:graphicData uri="http://schemas.openxmlformats.org/drawingml/2006/picture">
                 <pic:pic>
                   <pic:nvPicPr>
-                    <pic:cNvPr id="0" name="tmp8cc9k10e.png"/>
+                    <pic:cNvPr id="0" name="tmp03ddt3on.png"/>
                     <pic:cNvPicPr/>
                   </pic:nvPicPr>
                   <pic:blipFill>
@@ -5173,7 +5355,7 @@
         <w:ind w:left="369" w:hanging="142"/>
       </w:pPr>
       <w:r>
-        <w:t>47 API unit-тестів;</w:t>
+        <w:t>98 API unit-тестів;</w:t>
       </w:r>
     </w:p>
     <w:p>
@@ -5183,7 +5365,7 @@
         <w:ind w:left="369" w:hanging="142"/>
       </w:pPr>
       <w:r>
-        <w:t>51 web unit-тест;</w:t>
+        <w:t>61 web unit-тест;</w:t>
       </w:r>
     </w:p>
     <w:p>
@@ -5193,7 +5375,7 @@
         <w:ind w:left="369" w:hanging="142"/>
       </w:pPr>
       <w:r>
-        <w:t>16 Playwright-сценаріїв;</w:t>
+        <w:t>34 Playwright-сценарії у 13 файлах;</w:t>
       </w:r>
     </w:p>
     <w:p>
@@ -5203,7 +5385,12 @@
         <w:ind w:left="369" w:hanging="142"/>
       </w:pPr>
       <w:r>
-        <w:t>API integration для транзакцій, дозволів, timezone і конкурентності;</w:t>
+        <w:t>API integration для транзакцій, дозволів, RSVP, upload policy,</w:t>
+      </w:r>
+    </w:p>
+    <w:p>
+      <w:r>
+        <w:t>адміністративних меж, timezone і конкурентності;</w:t>
       </w:r>
     </w:p>
     <w:p>
@@ -5214,6 +5401,16 @@
       </w:pPr>
       <w:r>
         <w:t>browser regression для критичних маршрутів і чотирьох viewport;</w:t>
+      </w:r>
+    </w:p>
+    <w:p>
+      <w:pPr>
+        <w:pStyle w:val="ListBullet"/>
+        <w:spacing w:after="60"/>
+        <w:ind w:left="369" w:hanging="142"/>
+      </w:pPr>
+      <w:r>
+        <w:t>короткі Firefox/WebKit smoke та реальна просторова навігація у Chromium;</w:t>
       </w:r>
     </w:p>
     <w:p>
@@ -5316,7 +5513,7 @@
     </w:p>
     <w:p>
       <w:r>
-        <w:t xml:space="preserve">Health checks є в PostgreSQL, API, web і Nginx. Persistent дані зберігаються у volumes </w:t>
+        <w:t xml:space="preserve">Health checks є в PostgreSQL, API, worker і Nginx. Worker health перевіряє свіжий атомарний heartbeat, а не лише існування процесу. Persistent дані зберігаються у volumes </w:t>
       </w:r>
       <w:r>
         <w:rPr>
@@ -5338,7 +5535,89 @@
         <w:t>uploads</w:t>
       </w:r>
       <w:r>
-        <w:t>.</w:t>
+        <w:t xml:space="preserve">. Application-контейнери працюють без root, із read-only root filesystem, </w:t>
+      </w:r>
+      <w:r>
+        <w:rPr>
+          <w:rFonts w:ascii="Courier New" w:hAnsi="Courier New"/>
+          <w:color w:val="1488FF"/>
+          <w:sz w:val="18"/>
+        </w:rPr>
+        <w:t>cap_drop: ALL</w:t>
+      </w:r>
+      <w:r>
+        <w:t xml:space="preserve">, </w:t>
+      </w:r>
+      <w:r>
+        <w:rPr>
+          <w:rFonts w:ascii="Courier New" w:hAnsi="Courier New"/>
+          <w:color w:val="1488FF"/>
+          <w:sz w:val="18"/>
+        </w:rPr>
+        <w:t>no-new-privileges</w:t>
+      </w:r>
+      <w:r>
+        <w:t>, restart policy та контрольованим graceful shutdown.</w:t>
+      </w:r>
+    </w:p>
+    <w:p>
+      <w:r>
+        <w:t xml:space="preserve">DEMO і production використовують один </w:t>
+      </w:r>
+      <w:r>
+        <w:rPr>
+          <w:rFonts w:ascii="Courier New" w:hAnsi="Courier New"/>
+          <w:color w:val="1488FF"/>
+          <w:sz w:val="18"/>
+        </w:rPr>
+        <w:t>compose.yaml</w:t>
+      </w:r>
+      <w:r>
+        <w:t xml:space="preserve">. Режим визначається через </w:t>
+      </w:r>
+      <w:r>
+        <w:rPr>
+          <w:rFonts w:ascii="Courier New" w:hAnsi="Courier New"/>
+          <w:color w:val="1488FF"/>
+          <w:sz w:val="18"/>
+        </w:rPr>
+        <w:t>.env</w:t>
+      </w:r>
+      <w:r>
+        <w:t xml:space="preserve">: для production потрібні </w:t>
+      </w:r>
+      <w:r>
+        <w:rPr>
+          <w:rFonts w:ascii="Courier New" w:hAnsi="Courier New"/>
+          <w:color w:val="1488FF"/>
+          <w:sz w:val="18"/>
+        </w:rPr>
+        <w:t>NODE_ENV=production</w:t>
+      </w:r>
+      <w:r>
+        <w:t xml:space="preserve">, </w:t>
+      </w:r>
+      <w:r>
+        <w:rPr>
+          <w:rFonts w:ascii="Courier New" w:hAnsi="Courier New"/>
+          <w:color w:val="1488FF"/>
+          <w:sz w:val="18"/>
+        </w:rPr>
+        <w:t>APP_MODE=PRODUCTION</w:t>
+      </w:r>
+      <w:r>
+        <w:t xml:space="preserve"> і </w:t>
+      </w:r>
+      <w:r>
+        <w:rPr>
+          <w:rFonts w:ascii="Courier New" w:hAnsi="Courier New"/>
+          <w:color w:val="1488FF"/>
+          <w:sz w:val="18"/>
+        </w:rPr>
+        <w:t>SEED_DEMO_DATA=false</w:t>
+      </w:r>
+      <w:r>
+        <w:t>. API fail-fast перевіряє поєднання режимів, а pre-migration guard не дозволяє виконати demo seed у production.</w:t>
       </w:r>
     </w:p>
     <w:p>
@@ -5414,17 +5693,12 @@
         <w:ind w:left="369" w:hanging="142"/>
       </w:pPr>
       <w:r>
-        <w:t>налаштувати резервне копіювання PostgreSQL та uploads;</w:t>
+        <w:t>централізувати logs і health monitoring.</w:t>
       </w:r>
     </w:p>
     <w:p>
-      <w:pPr>
-        <w:pStyle w:val="ListBullet"/>
-        <w:spacing w:after="60"/>
-        <w:ind w:left="369" w:hanging="142"/>
-      </w:pPr>
-      <w:r>
-        <w:t>централізувати logs і health monitoring.</w:t>
+      <w:r>
+        <w:t>Вбудовані операторські скрипти створюють узгоджений backup PostgreSQL та uploads із SHA-256 manifest. Restore вимагає явного підтвердження, перевіряє архіви до заміни даних і навмисно залишає worker зупиненим до ручного перегляду черги доставок.</w:t>
       </w:r>
     </w:p>
     <w:p>

</xml_diff>

<commit_message>
docs(release): record v0.2.0 publication
</commit_message>
<xml_diff>
--- a/docs/MeetBroker-Technical-Overview.docx
+++ b/docs/MeetBroker-Technical-Overview.docx
@@ -128,7 +128,7 @@
               <a:graphicData uri="http://schemas.openxmlformats.org/drawingml/2006/picture">
                 <pic:pic>
                   <pic:nvPicPr>
-                    <pic:cNvPr id="0" name="tmpj7mxdrkh.png"/>
+                    <pic:cNvPr id="0" name="tmps_sjafif.png"/>
                     <pic:cNvPicPr/>
                   </pic:nvPicPr>
                   <pic:blipFill>
@@ -2128,7 +2128,7 @@
               <a:graphicData uri="http://schemas.openxmlformats.org/drawingml/2006/picture">
                 <pic:pic>
                   <pic:nvPicPr>
-                    <pic:cNvPr id="0" name="tmp87o05i6k.png"/>
+                    <pic:cNvPr id="0" name="tmpg4c9ba46.png"/>
                     <pic:cNvPicPr/>
                   </pic:nvPicPr>
                   <pic:blipFill>
@@ -4970,7 +4970,7 @@
               <a:graphicData uri="http://schemas.openxmlformats.org/drawingml/2006/picture">
                 <pic:pic>
                   <pic:nvPicPr>
-                    <pic:cNvPr id="0" name="tmp6t6t2os1.png"/>
+                    <pic:cNvPr id="0" name="tmpdryzlht2.png"/>
                     <pic:cNvPicPr/>
                   </pic:nvPicPr>
                   <pic:blipFill>
@@ -5251,7 +5251,7 @@
               <a:graphicData uri="http://schemas.openxmlformats.org/drawingml/2006/picture">
                 <pic:pic>
                   <pic:nvPicPr>
-                    <pic:cNvPr id="0" name="tmp03ddt3on.png"/>
+                    <pic:cNvPr id="0" name="tmpstgrxt0z.png"/>
                     <pic:cNvPicPr/>
                   </pic:nvPicPr>
                   <pic:blipFill>

</xml_diff>